<commit_message>
finalited assignment 2 report
</commit_message>
<xml_diff>
--- a/Assignment-2/Report/Assignment-2-Report-Kornidesz-Mate.docx
+++ b/Assignment-2/Report/Assignment-2-Report-Kornidesz-Mate.docx
@@ -20,67 +20,7 @@
         <w:rPr>
           <w:lang w:val="en-GB"/>
         </w:rPr>
-        <w:t xml:space="preserve">nalysis of CPU vs. GPU </w:t>
-      </w:r>
-      <w:r>
-        <w:rPr>
-          <w:lang w:val="en-GB"/>
-        </w:rPr>
-        <w:t>p</w:t>
-      </w:r>
-      <w:r>
-        <w:rPr>
-          <w:lang w:val="en-GB"/>
-        </w:rPr>
-        <w:t xml:space="preserve">erformance in </w:t>
-      </w:r>
-      <w:r>
-        <w:rPr>
-          <w:lang w:val="en-GB"/>
-        </w:rPr>
-        <w:t>r</w:t>
-      </w:r>
-      <w:r>
-        <w:rPr>
-          <w:lang w:val="en-GB"/>
-        </w:rPr>
-        <w:t>eal-</w:t>
-      </w:r>
-      <w:r>
-        <w:rPr>
-          <w:lang w:val="en-GB"/>
-        </w:rPr>
-        <w:t>t</w:t>
-      </w:r>
-      <w:r>
-        <w:rPr>
-          <w:lang w:val="en-GB"/>
-        </w:rPr>
-        <w:t xml:space="preserve">ime </w:t>
-      </w:r>
-      <w:r>
-        <w:rPr>
-          <w:lang w:val="en-GB"/>
-        </w:rPr>
-        <w:t>i</w:t>
-      </w:r>
-      <w:r>
-        <w:rPr>
-          <w:lang w:val="en-GB"/>
-        </w:rPr>
-        <w:t xml:space="preserve">mage </w:t>
-      </w:r>
-      <w:r>
-        <w:rPr>
-          <w:lang w:val="en-GB"/>
-        </w:rPr>
-        <w:t>p</w:t>
-      </w:r>
-      <w:r>
-        <w:rPr>
-          <w:lang w:val="en-GB"/>
-        </w:rPr>
-        <w:t>rocessing</w:t>
+        <w:t>nalysis of CPU vs. GPU performance in real-time image processing</w:t>
       </w:r>
     </w:p>
     <w:p>
@@ -632,7 +572,7 @@
         <w:rPr>
           <w:lang w:val="en-GB"/>
         </w:rPr>
-        <w:t>Hardware and Software Environment</w:t>
+        <w:t>Technical details</w:t>
       </w:r>
       <w:r>
         <w:rPr>
@@ -641,247 +581,318 @@
         <w:br/>
       </w:r>
     </w:p>
-    <w:p>
-      <w:pPr>
-        <w:numPr>
-          <w:ilvl w:val="0"/>
-          <w:numId w:val="2"/>
-        </w:numPr>
-        <w:rPr>
-          <w:lang w:val="en-GB"/>
-        </w:rPr>
-      </w:pPr>
-      <w:r>
-        <w:rPr>
-          <w:b/>
-          <w:bCs/>
-          <w:lang w:val="en-GB"/>
-        </w:rPr>
-        <w:t>CPU</w:t>
-      </w:r>
-      <w:r>
-        <w:rPr>
-          <w:lang w:val="en-GB"/>
-        </w:rPr>
-        <w:t xml:space="preserve">: </w:t>
-      </w:r>
-      <w:r>
-        <w:rPr>
-          <w:i/>
-          <w:iCs/>
-          <w:lang w:val="en-GB"/>
-        </w:rPr>
-        <w:t xml:space="preserve">AMD Ryzen 7 7735HS  </w:t>
-      </w:r>
-    </w:p>
-    <w:p>
-      <w:pPr>
-        <w:numPr>
-          <w:ilvl w:val="0"/>
-          <w:numId w:val="2"/>
-        </w:numPr>
-        <w:rPr>
-          <w:lang w:val="en-GB"/>
-        </w:rPr>
-      </w:pPr>
-      <w:r>
-        <w:rPr>
-          <w:b/>
-          <w:bCs/>
-          <w:lang w:val="en-GB"/>
-        </w:rPr>
-        <w:t>GPU</w:t>
-      </w:r>
-      <w:r>
-        <w:rPr>
-          <w:lang w:val="en-GB"/>
-        </w:rPr>
-        <w:t xml:space="preserve">: </w:t>
-      </w:r>
-      <w:r>
-        <w:rPr>
-          <w:i/>
-          <w:iCs/>
-          <w:lang w:val="en-GB"/>
-        </w:rPr>
-        <w:t>NVIDIA GeForce RTX 4050 Laptop GPU</w:t>
-      </w:r>
-    </w:p>
-    <w:p>
-      <w:pPr>
-        <w:numPr>
-          <w:ilvl w:val="0"/>
-          <w:numId w:val="2"/>
-        </w:numPr>
-        <w:rPr>
-          <w:lang w:val="en-GB"/>
-        </w:rPr>
-      </w:pPr>
-      <w:r>
-        <w:rPr>
-          <w:b/>
-          <w:bCs/>
-          <w:lang w:val="en-GB"/>
-        </w:rPr>
-        <w:t>Memory</w:t>
-      </w:r>
-      <w:r>
-        <w:rPr>
-          <w:lang w:val="en-GB"/>
-        </w:rPr>
-        <w:t xml:space="preserve">: </w:t>
-      </w:r>
-      <w:r>
-        <w:rPr>
-          <w:i/>
-          <w:iCs/>
-          <w:lang w:val="en-GB"/>
-        </w:rPr>
-        <w:t>16 GB RAM</w:t>
-      </w:r>
-    </w:p>
-    <w:p>
-      <w:pPr>
-        <w:numPr>
-          <w:ilvl w:val="0"/>
-          <w:numId w:val="2"/>
-        </w:numPr>
-        <w:jc w:val="both"/>
-        <w:rPr>
-          <w:lang w:val="en-GB"/>
-        </w:rPr>
-      </w:pPr>
-      <w:r>
-        <w:rPr>
-          <w:b/>
-          <w:bCs/>
-          <w:lang w:val="en-GB"/>
-        </w:rPr>
-        <w:t xml:space="preserve">Development </w:t>
-      </w:r>
-      <w:r>
-        <w:rPr>
-          <w:b/>
-          <w:bCs/>
-          <w:lang w:val="en-GB"/>
-        </w:rPr>
-        <w:t>e</w:t>
-      </w:r>
-      <w:r>
-        <w:rPr>
-          <w:b/>
-          <w:bCs/>
-          <w:lang w:val="en-GB"/>
-        </w:rPr>
-        <w:t>nvironment</w:t>
-      </w:r>
-      <w:r>
-        <w:rPr>
-          <w:lang w:val="en-GB"/>
-        </w:rPr>
-        <w:t xml:space="preserve">: </w:t>
-      </w:r>
-      <w:r>
-        <w:rPr>
-          <w:i/>
-          <w:iCs/>
-          <w:lang w:val="en-GB"/>
-        </w:rPr>
-        <w:t>2022 Visual Studio IDE, Windows SDK</w:t>
-      </w:r>
-      <w:r>
-        <w:rPr>
-          <w:i/>
-          <w:iCs/>
-          <w:lang w:val="en-GB"/>
-        </w:rPr>
-        <w:t xml:space="preserve"> – Windows 10.0.26100.1</w:t>
-      </w:r>
-    </w:p>
-    <w:p>
-      <w:pPr>
-        <w:numPr>
-          <w:ilvl w:val="0"/>
-          <w:numId w:val="2"/>
-        </w:numPr>
-        <w:jc w:val="both"/>
-        <w:rPr>
-          <w:lang w:val="en-GB"/>
-        </w:rPr>
-      </w:pPr>
-      <w:r>
-        <w:rPr>
-          <w:b/>
-          <w:bCs/>
-          <w:lang w:val="en-GB"/>
-        </w:rPr>
-        <w:t>External l</w:t>
-      </w:r>
-      <w:r>
-        <w:rPr>
-          <w:b/>
-          <w:bCs/>
-          <w:lang w:val="en-GB"/>
-        </w:rPr>
-        <w:t>ibrar</w:t>
-      </w:r>
-      <w:r>
-        <w:rPr>
-          <w:b/>
-          <w:bCs/>
-          <w:lang w:val="en-GB"/>
-        </w:rPr>
-        <w:t>ies</w:t>
-      </w:r>
-      <w:r>
-        <w:rPr>
-          <w:lang w:val="en-GB"/>
-        </w:rPr>
-        <w:t xml:space="preserve">: </w:t>
-      </w:r>
-      <w:r>
-        <w:rPr>
-          <w:lang w:val="en-GB"/>
-        </w:rPr>
-        <w:t>opencv:x64-windows</w:t>
-      </w:r>
-      <w:r>
-        <w:rPr>
-          <w:lang w:val="en-GB"/>
-        </w:rPr>
-        <w:t>,</w:t>
-      </w:r>
-      <w:r>
-        <w:rPr>
-          <w:lang w:val="en-GB"/>
-        </w:rPr>
-        <w:t xml:space="preserve"> glfw3:x64-windows</w:t>
-      </w:r>
-      <w:r>
-        <w:rPr>
-          <w:lang w:val="en-GB"/>
-        </w:rPr>
-        <w:t>,</w:t>
-      </w:r>
-      <w:r>
-        <w:rPr>
-          <w:lang w:val="en-GB"/>
-        </w:rPr>
-        <w:t xml:space="preserve"> glad:x64-windows</w:t>
-      </w:r>
-      <w:r>
-        <w:rPr>
-          <w:lang w:val="en-GB"/>
-        </w:rPr>
-        <w:t>,</w:t>
-      </w:r>
-      <w:r>
-        <w:rPr>
-          <w:lang w:val="en-GB"/>
-        </w:rPr>
-        <w:t xml:space="preserve"> glm:x64-windows</w:t>
-      </w:r>
-    </w:p>
+    <w:tbl>
+      <w:tblPr>
+        <w:tblStyle w:val="Rcsostblzat"/>
+        <w:tblW w:w="0" w:type="auto"/>
+        <w:tblInd w:w="720" w:type="dxa"/>
+        <w:tblLook w:val="04A0" w:firstRow="1" w:lastRow="0" w:firstColumn="1" w:lastColumn="0" w:noHBand="0" w:noVBand="1"/>
+      </w:tblPr>
+      <w:tblGrid>
+        <w:gridCol w:w="4175"/>
+        <w:gridCol w:w="4167"/>
+      </w:tblGrid>
+      <w:tr>
+        <w:trPr>
+          <w:trHeight w:val="537"/>
+        </w:trPr>
+        <w:tc>
+          <w:tcPr>
+            <w:tcW w:w="4175" w:type="dxa"/>
+          </w:tcPr>
+          <w:p>
+            <w:pPr>
+              <w:rPr>
+                <w:lang w:val="en-GB"/>
+              </w:rPr>
+            </w:pPr>
+            <w:r>
+              <w:rPr>
+                <w:b/>
+                <w:bCs/>
+                <w:lang w:val="en-GB"/>
+              </w:rPr>
+              <w:t>CPU</w:t>
+            </w:r>
+          </w:p>
+        </w:tc>
+        <w:tc>
+          <w:tcPr>
+            <w:tcW w:w="4167" w:type="dxa"/>
+          </w:tcPr>
+          <w:p>
+            <w:pPr>
+              <w:rPr>
+                <w:lang w:val="en-GB"/>
+              </w:rPr>
+            </w:pPr>
+            <w:r>
+              <w:rPr>
+                <w:lang w:val="en-GB"/>
+              </w:rPr>
+              <w:t xml:space="preserve"> </w:t>
+            </w:r>
+            <w:r>
+              <w:rPr>
+                <w:i/>
+                <w:iCs/>
+                <w:lang w:val="en-GB"/>
+              </w:rPr>
+              <w:t xml:space="preserve">AMD Ryzen 7 7735HS  </w:t>
+            </w:r>
+          </w:p>
+        </w:tc>
+      </w:tr>
+      <w:tr>
+        <w:trPr>
+          <w:trHeight w:val="537"/>
+        </w:trPr>
+        <w:tc>
+          <w:tcPr>
+            <w:tcW w:w="4175" w:type="dxa"/>
+          </w:tcPr>
+          <w:p>
+            <w:pPr>
+              <w:rPr>
+                <w:lang w:val="en-GB"/>
+              </w:rPr>
+            </w:pPr>
+            <w:r>
+              <w:rPr>
+                <w:b/>
+                <w:bCs/>
+                <w:lang w:val="en-GB"/>
+              </w:rPr>
+              <w:t>GPU</w:t>
+            </w:r>
+          </w:p>
+        </w:tc>
+        <w:tc>
+          <w:tcPr>
+            <w:tcW w:w="4167" w:type="dxa"/>
+          </w:tcPr>
+          <w:p>
+            <w:pPr>
+              <w:rPr>
+                <w:lang w:val="en-GB"/>
+              </w:rPr>
+            </w:pPr>
+            <w:r>
+              <w:rPr>
+                <w:lang w:val="en-GB"/>
+              </w:rPr>
+              <w:t xml:space="preserve"> </w:t>
+            </w:r>
+            <w:r>
+              <w:rPr>
+                <w:i/>
+                <w:iCs/>
+                <w:lang w:val="en-GB"/>
+              </w:rPr>
+              <w:t>NVIDIA GeForce RTX 4050 Laptop GPU</w:t>
+            </w:r>
+          </w:p>
+        </w:tc>
+      </w:tr>
+      <w:tr>
+        <w:trPr>
+          <w:trHeight w:val="537"/>
+        </w:trPr>
+        <w:tc>
+          <w:tcPr>
+            <w:tcW w:w="4175" w:type="dxa"/>
+          </w:tcPr>
+          <w:p>
+            <w:pPr>
+              <w:rPr>
+                <w:lang w:val="en-GB"/>
+              </w:rPr>
+            </w:pPr>
+            <w:r>
+              <w:rPr>
+                <w:b/>
+                <w:bCs/>
+                <w:lang w:val="en-GB"/>
+              </w:rPr>
+              <w:t>RAM</w:t>
+            </w:r>
+          </w:p>
+        </w:tc>
+        <w:tc>
+          <w:tcPr>
+            <w:tcW w:w="4167" w:type="dxa"/>
+          </w:tcPr>
+          <w:p>
+            <w:pPr>
+              <w:rPr>
+                <w:lang w:val="en-GB"/>
+              </w:rPr>
+            </w:pPr>
+            <w:r>
+              <w:rPr>
+                <w:lang w:val="en-GB"/>
+              </w:rPr>
+              <w:t xml:space="preserve"> </w:t>
+            </w:r>
+            <w:r>
+              <w:rPr>
+                <w:i/>
+                <w:iCs/>
+                <w:lang w:val="en-GB"/>
+              </w:rPr>
+              <w:t>16 GB RAM</w:t>
+            </w:r>
+          </w:p>
+        </w:tc>
+      </w:tr>
+      <w:tr>
+        <w:trPr>
+          <w:trHeight w:val="537"/>
+        </w:trPr>
+        <w:tc>
+          <w:tcPr>
+            <w:tcW w:w="4175" w:type="dxa"/>
+          </w:tcPr>
+          <w:p>
+            <w:pPr>
+              <w:jc w:val="both"/>
+              <w:rPr>
+                <w:lang w:val="en-GB"/>
+              </w:rPr>
+            </w:pPr>
+            <w:r>
+              <w:rPr>
+                <w:b/>
+                <w:bCs/>
+                <w:lang w:val="en-GB"/>
+              </w:rPr>
+              <w:t>Development environment</w:t>
+            </w:r>
+          </w:p>
+        </w:tc>
+        <w:tc>
+          <w:tcPr>
+            <w:tcW w:w="4167" w:type="dxa"/>
+          </w:tcPr>
+          <w:p>
+            <w:pPr>
+              <w:jc w:val="both"/>
+              <w:rPr>
+                <w:lang w:val="en-GB"/>
+              </w:rPr>
+            </w:pPr>
+            <w:r>
+              <w:rPr>
+                <w:lang w:val="en-GB"/>
+              </w:rPr>
+              <w:t xml:space="preserve"> </w:t>
+            </w:r>
+            <w:r>
+              <w:rPr>
+                <w:i/>
+                <w:iCs/>
+                <w:lang w:val="en-GB"/>
+              </w:rPr>
+              <w:t>2022 Visual Studio IDE, Windows SDK – Windows 10.0.26100.1</w:t>
+            </w:r>
+          </w:p>
+        </w:tc>
+      </w:tr>
+      <w:tr>
+        <w:trPr>
+          <w:trHeight w:val="537"/>
+        </w:trPr>
+        <w:tc>
+          <w:tcPr>
+            <w:tcW w:w="4175" w:type="dxa"/>
+          </w:tcPr>
+          <w:p>
+            <w:pPr>
+              <w:jc w:val="both"/>
+              <w:rPr>
+                <w:lang w:val="en-GB"/>
+              </w:rPr>
+            </w:pPr>
+            <w:r>
+              <w:rPr>
+                <w:b/>
+                <w:bCs/>
+                <w:lang w:val="en-GB"/>
+              </w:rPr>
+              <w:lastRenderedPageBreak/>
+              <w:t>External libraries</w:t>
+            </w:r>
+          </w:p>
+        </w:tc>
+        <w:tc>
+          <w:tcPr>
+            <w:tcW w:w="4167" w:type="dxa"/>
+          </w:tcPr>
+          <w:p>
+            <w:pPr>
+              <w:jc w:val="both"/>
+              <w:rPr>
+                <w:lang w:val="en-GB"/>
+              </w:rPr>
+            </w:pPr>
+            <w:r>
+              <w:rPr>
+                <w:lang w:val="en-GB"/>
+              </w:rPr>
+              <w:t xml:space="preserve"> opencv</w:t>
+            </w:r>
+            <w:r>
+              <w:rPr>
+                <w:lang w:val="en-GB"/>
+              </w:rPr>
+              <w:t>:</w:t>
+            </w:r>
+            <w:r>
+              <w:rPr>
+                <w:lang w:val="en-GB"/>
+              </w:rPr>
+              <w:t>x64-windows, glfw3</w:t>
+            </w:r>
+            <w:r>
+              <w:rPr>
+                <w:lang w:val="en-GB"/>
+              </w:rPr>
+              <w:t>:</w:t>
+            </w:r>
+            <w:r>
+              <w:rPr>
+                <w:lang w:val="en-GB"/>
+              </w:rPr>
+              <w:t>x64-windows, glad</w:t>
+            </w:r>
+            <w:r>
+              <w:rPr>
+                <w:lang w:val="en-GB"/>
+              </w:rPr>
+              <w:t>:</w:t>
+            </w:r>
+            <w:r>
+              <w:rPr>
+                <w:lang w:val="en-GB"/>
+              </w:rPr>
+              <w:t>x64-windows, glm</w:t>
+            </w:r>
+            <w:r>
+              <w:rPr>
+                <w:lang w:val="en-GB"/>
+              </w:rPr>
+              <w:t>:</w:t>
+            </w:r>
+            <w:r>
+              <w:rPr>
+                <w:lang w:val="en-GB"/>
+              </w:rPr>
+              <w:t>x64-windows</w:t>
+            </w:r>
+          </w:p>
+        </w:tc>
+      </w:tr>
+    </w:tbl>
     <w:p>
       <w:pPr>
         <w:pStyle w:val="Cmsor3"/>
@@ -893,7 +904,6 @@
         <w:rPr>
           <w:lang w:val="en-GB"/>
         </w:rPr>
-        <w:lastRenderedPageBreak/>
         <w:t xml:space="preserve">   </w:t>
       </w:r>
       <w:r>
@@ -1129,13 +1139,31 @@
               <w:rPr>
                 <w:lang w:val="en-GB"/>
               </w:rPr>
-              <w:t xml:space="preserve">Standard HD (1280×720) and </w:t>
-            </w:r>
-            <w:r>
-              <w:rPr>
-                <w:lang w:val="en-GB"/>
-              </w:rPr>
-              <w:t>Low</w:t>
+              <w:t xml:space="preserve">HD (1280×720) </w:t>
+            </w:r>
+            <w:r>
+              <w:rPr>
+                <w:lang w:val="en-GB"/>
+              </w:rPr>
+              <w:t>&amp;</w:t>
+            </w:r>
+            <w:r>
+              <w:rPr>
+                <w:lang w:val="en-GB"/>
+              </w:rPr>
+              <w:t xml:space="preserve"> </w:t>
+            </w:r>
+            <w:r>
+              <w:rPr>
+                <w:lang w:val="en-GB"/>
+              </w:rPr>
+              <w:t>L</w:t>
+            </w:r>
+            <w:r>
+              <w:rPr>
+                <w:lang w:val="en-GB"/>
+              </w:rPr>
+              <w:t>OW</w:t>
             </w:r>
             <w:r>
               <w:rPr>
@@ -1573,6 +1601,12 @@
           <w:lang w:val="en-GB"/>
         </w:rPr>
       </w:pPr>
+      <w:r>
+        <w:rPr>
+          <w:lang w:val="en-GB"/>
+        </w:rPr>
+        <w:t xml:space="preserve">   </w:t>
+      </w:r>
       <w:r>
         <w:rPr>
           <w:lang w:val="en-GB"/>
@@ -1640,6 +1674,7 @@
                 <w:bCs/>
                 <w:lang w:val="en-GB"/>
               </w:rPr>
+              <w:lastRenderedPageBreak/>
               <w:t>Filter</w:t>
             </w:r>
           </w:p>
@@ -1888,7 +1923,6 @@
               <w:rPr>
                 <w:lang w:val="en-GB"/>
               </w:rPr>
-              <w:lastRenderedPageBreak/>
               <w:t>Si</w:t>
             </w:r>
             <w:r>
@@ -2123,6 +2157,7 @@
         <w:rPr>
           <w:b/>
           <w:bCs/>
+          <w:noProof/>
           <w:lang w:val="en-GB"/>
         </w:rPr>
         <w:drawing>
@@ -2171,6 +2206,7 @@
         <w:rPr>
           <w:b/>
           <w:bCs/>
+          <w:noProof/>
           <w:lang w:val="en-GB"/>
         </w:rPr>
         <w:drawing>
@@ -2357,6 +2393,12 @@
         <w:rPr>
           <w:lang w:val="en-GB"/>
         </w:rPr>
+        <w:t xml:space="preserve">   </w:t>
+      </w:r>
+      <w:r>
+        <w:rPr>
+          <w:lang w:val="en-GB"/>
+        </w:rPr>
         <w:t>Filters: Normal – Pixelate – Si</w:t>
       </w:r>
       <w:r>
@@ -2405,6 +2447,7 @@
       </w:pPr>
       <w:r>
         <w:rPr>
+          <w:noProof/>
           <w:lang w:val="en-GB"/>
         </w:rPr>
         <w:drawing>
@@ -2445,6 +2488,7 @@
       </w:r>
       <w:r>
         <w:rPr>
+          <w:noProof/>
           <w:lang w:val="en-GB"/>
         </w:rPr>
         <w:drawing>
@@ -2485,6 +2529,7 @@
       </w:r>
       <w:r>
         <w:rPr>
+          <w:noProof/>
           <w:lang w:val="en-GB"/>
         </w:rPr>
         <w:drawing>
@@ -2525,6 +2570,7 @@
       </w:r>
       <w:r>
         <w:rPr>
+          <w:noProof/>
           <w:lang w:val="en-GB"/>
         </w:rPr>
         <w:drawing>
@@ -2583,7 +2629,12 @@
         <w:rPr>
           <w:lang w:val="en-GB"/>
         </w:rPr>
-        <w:lastRenderedPageBreak/>
+        <w:t xml:space="preserve">   </w:t>
+      </w:r>
+      <w:r>
+        <w:rPr>
+          <w:lang w:val="en-GB"/>
+        </w:rPr>
         <w:t>Resolution Comparison</w:t>
       </w:r>
     </w:p>
@@ -2607,6 +2658,7 @@
         <w:rPr>
           <w:b/>
           <w:bCs/>
+          <w:noProof/>
           <w:lang w:val="en-GB"/>
         </w:rPr>
         <w:drawing>
@@ -2713,6 +2765,12 @@
           <w:lang w:val="en-GB"/>
         </w:rPr>
       </w:pPr>
+      <w:r>
+        <w:rPr>
+          <w:lang w:val="en-GB"/>
+        </w:rPr>
+        <w:t xml:space="preserve">   </w:t>
+      </w:r>
       <w:r>
         <w:rPr>
           <w:lang w:val="en-GB"/>
@@ -2992,6 +3050,7 @@
         <w:rPr>
           <w:b/>
           <w:bCs/>
+          <w:noProof/>
           <w:lang w:val="en-GB"/>
         </w:rPr>
         <w:drawing>
@@ -3083,7 +3142,13 @@
           <w:lang w:val="en-GB"/>
         </w:rPr>
         <w:lastRenderedPageBreak/>
-        <w:t>3.4 Effect of Geometric Transformations</w:t>
+        <w:t xml:space="preserve">   </w:t>
+      </w:r>
+      <w:r>
+        <w:rPr>
+          <w:lang w:val="en-GB"/>
+        </w:rPr>
+        <w:t>Effect of Geometric Transformations</w:t>
       </w:r>
     </w:p>
     <w:p>
@@ -3401,6 +3466,7 @@
         <w:rPr>
           <w:b/>
           <w:bCs/>
+          <w:noProof/>
           <w:lang w:val="en-GB"/>
         </w:rPr>
         <w:drawing>
@@ -3464,6 +3530,148 @@
     </w:p>
     <w:p>
       <w:pPr>
+        <w:pStyle w:val="Cmsor3"/>
+        <w:rPr>
+          <w:lang w:val="en-GB"/>
+        </w:rPr>
+      </w:pPr>
+      <w:r>
+        <w:rPr>
+          <w:lang w:val="en-GB"/>
+        </w:rPr>
+        <w:t xml:space="preserve">   Transforms: Pan – Rotate – Zoom</w:t>
+      </w:r>
+    </w:p>
+    <w:p>
+      <w:pPr>
+        <w:jc w:val="center"/>
+        <w:rPr>
+          <w:lang w:val="en-GB"/>
+        </w:rPr>
+      </w:pPr>
+      <w:r>
+        <w:rPr>
+          <w:lang w:val="en-GB"/>
+        </w:rPr>
+        <w:drawing>
+          <wp:inline distT="0" distB="0" distL="0" distR="0" wp14:anchorId="7F74837E" wp14:editId="3CF72DBD">
+            <wp:extent cx="1515600" cy="900000"/>
+            <wp:effectExtent l="0" t="0" r="8890" b="0"/>
+            <wp:docPr id="1866273386" name="Kép 1"/>
+            <wp:cNvGraphicFramePr>
+              <a:graphicFrameLocks xmlns:a="http://schemas.openxmlformats.org/drawingml/2006/main" noChangeAspect="1"/>
+            </wp:cNvGraphicFramePr>
+            <a:graphic xmlns:a="http://schemas.openxmlformats.org/drawingml/2006/main">
+              <a:graphicData uri="http://schemas.openxmlformats.org/drawingml/2006/picture">
+                <pic:pic xmlns:pic="http://schemas.openxmlformats.org/drawingml/2006/picture">
+                  <pic:nvPicPr>
+                    <pic:cNvPr id="1866273386" name=""/>
+                    <pic:cNvPicPr/>
+                  </pic:nvPicPr>
+                  <pic:blipFill>
+                    <a:blip r:embed="rId16"/>
+                    <a:stretch>
+                      <a:fillRect/>
+                    </a:stretch>
+                  </pic:blipFill>
+                  <pic:spPr>
+                    <a:xfrm>
+                      <a:off x="0" y="0"/>
+                      <a:ext cx="1515600" cy="900000"/>
+                    </a:xfrm>
+                    <a:prstGeom prst="rect">
+                      <a:avLst/>
+                    </a:prstGeom>
+                  </pic:spPr>
+                </pic:pic>
+              </a:graphicData>
+            </a:graphic>
+          </wp:inline>
+        </w:drawing>
+      </w:r>
+      <w:r>
+        <w:rPr>
+          <w:lang w:val="en-GB"/>
+        </w:rPr>
+        <w:drawing>
+          <wp:inline distT="0" distB="0" distL="0" distR="0" wp14:anchorId="428F738A" wp14:editId="145051AC">
+            <wp:extent cx="1519200" cy="900000"/>
+            <wp:effectExtent l="0" t="0" r="5080" b="0"/>
+            <wp:docPr id="453931958" name="Kép 1"/>
+            <wp:cNvGraphicFramePr>
+              <a:graphicFrameLocks xmlns:a="http://schemas.openxmlformats.org/drawingml/2006/main" noChangeAspect="1"/>
+            </wp:cNvGraphicFramePr>
+            <a:graphic xmlns:a="http://schemas.openxmlformats.org/drawingml/2006/main">
+              <a:graphicData uri="http://schemas.openxmlformats.org/drawingml/2006/picture">
+                <pic:pic xmlns:pic="http://schemas.openxmlformats.org/drawingml/2006/picture">
+                  <pic:nvPicPr>
+                    <pic:cNvPr id="453931958" name=""/>
+                    <pic:cNvPicPr/>
+                  </pic:nvPicPr>
+                  <pic:blipFill>
+                    <a:blip r:embed="rId17"/>
+                    <a:stretch>
+                      <a:fillRect/>
+                    </a:stretch>
+                  </pic:blipFill>
+                  <pic:spPr>
+                    <a:xfrm>
+                      <a:off x="0" y="0"/>
+                      <a:ext cx="1519200" cy="900000"/>
+                    </a:xfrm>
+                    <a:prstGeom prst="rect">
+                      <a:avLst/>
+                    </a:prstGeom>
+                  </pic:spPr>
+                </pic:pic>
+              </a:graphicData>
+            </a:graphic>
+          </wp:inline>
+        </w:drawing>
+      </w:r>
+      <w:r>
+        <w:rPr>
+          <w:lang w:val="en-GB"/>
+        </w:rPr>
+        <w:drawing>
+          <wp:inline distT="0" distB="0" distL="0" distR="0" wp14:anchorId="1096E0B7" wp14:editId="71A28C51">
+            <wp:extent cx="1515600" cy="900000"/>
+            <wp:effectExtent l="0" t="0" r="8890" b="0"/>
+            <wp:docPr id="972077352" name="Kép 1"/>
+            <wp:cNvGraphicFramePr>
+              <a:graphicFrameLocks xmlns:a="http://schemas.openxmlformats.org/drawingml/2006/main" noChangeAspect="1"/>
+            </wp:cNvGraphicFramePr>
+            <a:graphic xmlns:a="http://schemas.openxmlformats.org/drawingml/2006/main">
+              <a:graphicData uri="http://schemas.openxmlformats.org/drawingml/2006/picture">
+                <pic:pic xmlns:pic="http://schemas.openxmlformats.org/drawingml/2006/picture">
+                  <pic:nvPicPr>
+                    <pic:cNvPr id="972077352" name=""/>
+                    <pic:cNvPicPr/>
+                  </pic:nvPicPr>
+                  <pic:blipFill>
+                    <a:blip r:embed="rId18"/>
+                    <a:stretch>
+                      <a:fillRect/>
+                    </a:stretch>
+                  </pic:blipFill>
+                  <pic:spPr>
+                    <a:xfrm>
+                      <a:off x="0" y="0"/>
+                      <a:ext cx="1515600" cy="900000"/>
+                    </a:xfrm>
+                    <a:prstGeom prst="rect">
+                      <a:avLst/>
+                    </a:prstGeom>
+                  </pic:spPr>
+                </pic:pic>
+              </a:graphicData>
+            </a:graphic>
+          </wp:inline>
+        </w:drawing>
+      </w:r>
+    </w:p>
+    <w:p>
+      <w:pPr>
         <w:rPr>
           <w:lang w:val="en-GB"/>
         </w:rPr>
@@ -3813,7 +4021,14 @@
         <w:rPr>
           <w:lang w:val="en-GB"/>
         </w:rPr>
-        <w:t xml:space="preserve">GPUs contain dedicated hardware pipelines for vertex and fragment transformations, whereas CPUs </w:t>
+        <w:t xml:space="preserve">GPUs contain dedicated hardware </w:t>
+      </w:r>
+      <w:r>
+        <w:rPr>
+          <w:lang w:val="en-GB"/>
+        </w:rPr>
+        <w:lastRenderedPageBreak/>
+        <w:t xml:space="preserve">pipelines for vertex and fragment transformations, whereas CPUs </w:t>
       </w:r>
       <w:r>
         <w:rPr>
@@ -3910,7 +4125,6 @@
           <w:bCs/>
           <w:lang w:val="en-GB"/>
         </w:rPr>
-        <w:lastRenderedPageBreak/>
         <w:t xml:space="preserve">Algorithm and resolution choices </w:t>
       </w:r>
       <w:r>
@@ -4749,7 +4963,7 @@
       </w:pPr>
     </w:p>
     <w:sectPr>
-      <w:footerReference w:type="default" r:id="rId16"/>
+      <w:footerReference w:type="default" r:id="rId19"/>
       <w:pgSz w:w="11906" w:h="16838"/>
       <w:pgMar w:top="1417" w:right="1417" w:bottom="1417" w:left="1417" w:header="708" w:footer="708" w:gutter="0"/>
       <w:cols w:space="708"/>
@@ -6181,6 +6395,7 @@
   <w:style w:type="character" w:default="1" w:styleId="Bekezdsalapbettpusa">
     <w:name w:val="Default Paragraph Font"/>
     <w:uiPriority w:val="1"/>
+    <w:semiHidden/>
     <w:unhideWhenUsed/>
   </w:style>
   <w:style w:type="table" w:default="1" w:styleId="Normltblzat">
@@ -6536,6 +6751,25 @@
     <w:uiPriority w:val="99"/>
     <w:rsid w:val="00D83167"/>
   </w:style>
+  <w:style w:type="table" w:styleId="Rcsostblzat">
+    <w:name w:val="Table Grid"/>
+    <w:basedOn w:val="Normltblzat"/>
+    <w:uiPriority w:val="39"/>
+    <w:rsid w:val="00365425"/>
+    <w:pPr>
+      <w:spacing w:after="0" w:line="240" w:lineRule="auto"/>
+    </w:pPr>
+    <w:tblPr>
+      <w:tblBorders>
+        <w:top w:val="single" w:sz="4" w:space="0" w:color="auto"/>
+        <w:left w:val="single" w:sz="4" w:space="0" w:color="auto"/>
+        <w:bottom w:val="single" w:sz="4" w:space="0" w:color="auto"/>
+        <w:right w:val="single" w:sz="4" w:space="0" w:color="auto"/>
+        <w:insideH w:val="single" w:sz="4" w:space="0" w:color="auto"/>
+        <w:insideV w:val="single" w:sz="4" w:space="0" w:color="auto"/>
+      </w:tblBorders>
+    </w:tblPr>
+  </w:style>
 </w:styles>
 </file>
 

</xml_diff>